<commit_message>
feat: permissões por usuário/módulo geridas pelo Admin + link Desbravador como referência
- Usuario.modulos (M2M) atribuído no Admin; superusuário acessa tudo
- Decorator @requer_modulo: módulo inativo → 404, sem acesso → 403
- Menu lateral e dashboard filtram por permissão do usuário
- 5 novos testes (13 no total)
- ESPECIFICACAO §4.2 e CLAUDE.md: processo de consulta ao Desbravador por módulo

Co-Authored-By: Claude Fable 5 <noreply@anthropic.com>
</commit_message>
<xml_diff>
--- a/docs/ESPECIFICACAO.docx
+++ b/docs/ESPECIFICACAO.docx
@@ -36,7 +36,7 @@
         </w:p>
       </w:sdtContent>
     </w:sdt>
-    <w:bookmarkStart w:id="40" w:name="especificação--crmpms-pousada-vô-testa"/>
+    <w:bookmarkStart w:id="41" w:name="especificação--crmpms-pousada-vô-testa"/>
     <w:p>
       <w:pPr>
         <w:pStyle w:val="Heading1"/>
@@ -60,7 +60,7 @@
         <w:t xml:space="preserve"> </w:t>
       </w:r>
       <w:r>
-        <w:t xml:space="preserve">0.1 (rascunho para refinamento)</w:t>
+        <w:t xml:space="preserve">0.2</w:t>
       </w:r>
       <w:r>
         <w:t xml:space="preserve"> </w:t>
@@ -88,9 +88,42 @@
         </w:rPr>
         <w:t xml:space="preserve">Referências:</w:t>
       </w:r>
-      <w:r>
-        <w:t xml:space="preserve"> </w:t>
-      </w:r>
+    </w:p>
+    <w:p>
+      <w:pPr>
+        <w:pStyle w:val="Compact"/>
+        <w:numPr>
+          <w:ilvl w:val="0"/>
+          <w:numId w:val="1001"/>
+        </w:numPr>
+      </w:pPr>
+      <w:r>
+        <w:rPr>
+          <w:b/>
+          <w:bCs/>
+        </w:rPr>
+        <w:t xml:space="preserve">Benchmark de mercado (consulta obrigatória):</w:t>
+      </w:r>
+      <w:r>
+        <w:t xml:space="preserve"> </w:t>
+      </w:r>
+      <w:hyperlink r:id="rId9">
+        <w:r>
+          <w:rPr>
+            <w:rStyle w:val="Hyperlink"/>
+          </w:rPr>
+          <w:t xml:space="preserve">https://www.desbravador.com.br/produtos/hoteis-e-pousadas</w:t>
+        </w:r>
+      </w:hyperlink>
+    </w:p>
+    <w:p>
+      <w:pPr>
+        <w:pStyle w:val="Compact"/>
+        <w:numPr>
+          <w:ilvl w:val="0"/>
+          <w:numId w:val="1001"/>
+        </w:numPr>
+      </w:pPr>
       <w:r>
         <w:rPr>
           <w:rStyle w:val="VerbatimChar"/>
@@ -98,16 +131,55 @@
         <w:t xml:space="preserve">docs/REFERENCIA_DESBRAVADOR.md</w:t>
       </w:r>
       <w:r>
-        <w:t xml:space="preserve">,</w:t>
-      </w:r>
-      <w:r>
-        <w:t xml:space="preserve"> </w:t>
-      </w:r>
+        <w:t xml:space="preserve"> </w:t>
+      </w:r>
+      <w:r>
+        <w:t xml:space="preserve">(levantamento dos 9 produtos)</w:t>
+      </w:r>
+    </w:p>
+    <w:p>
+      <w:pPr>
+        <w:pStyle w:val="Compact"/>
+        <w:numPr>
+          <w:ilvl w:val="0"/>
+          <w:numId w:val="1001"/>
+        </w:numPr>
+      </w:pPr>
       <w:r>
         <w:rPr>
           <w:rStyle w:val="VerbatimChar"/>
         </w:rPr>
-        <w:t xml:space="preserve">BASE_Projeto/apresentacao_easy_web.pdf</w:t>
+        <w:t xml:space="preserve">docs/apresentacao_easy_web.pdf</w:t>
+      </w:r>
+    </w:p>
+    <w:p>
+      <w:pPr>
+        <w:pStyle w:val="BlockText"/>
+      </w:pPr>
+      <w:r>
+        <w:rPr>
+          <w:b/>
+          <w:bCs/>
+        </w:rPr>
+        <w:t xml:space="preserve">Processo:</w:t>
+      </w:r>
+      <w:r>
+        <w:t xml:space="preserve"> </w:t>
+      </w:r>
+      <w:r>
+        <w:t xml:space="preserve">ao iniciar a construção de cada fase/módulo, consultar o link do</w:t>
+      </w:r>
+      <w:r>
+        <w:t xml:space="preserve"> </w:t>
+      </w:r>
+      <w:r>
+        <w:t xml:space="preserve">Desbravador acima (e o levantamento) para verificar como o mercado resolve</w:t>
+      </w:r>
+      <w:r>
+        <w:t xml:space="preserve"> </w:t>
+      </w:r>
+      <w:r>
+        <w:t xml:space="preserve">aquele módulo — funcionalidades, fluxos e telas — antes de desenhar o nosso.</w:t>
       </w:r>
     </w:p>
     <w:p>
@@ -117,7 +189,7 @@
         </w:pict>
       </w:r>
     </w:p>
-    <w:bookmarkStart w:id="10" w:name="Xe34d9c7c9c5b7fef514416b308db245f9e26992"/>
+    <w:bookmarkStart w:id="11" w:name="Xe34d9c7c9c5b7fef514416b308db245f9e26992"/>
     <w:p>
       <w:pPr>
         <w:pStyle w:val="Heading2"/>
@@ -189,7 +261,7 @@
         <w:t xml:space="preserve">A Pousada Vô Testa é o cliente nº 1 do produto.</w:t>
       </w:r>
     </w:p>
-    <w:bookmarkStart w:id="9" w:name="princípios-de-arquitetura"/>
+    <w:bookmarkStart w:id="10" w:name="princípios-de-arquitetura"/>
     <w:p>
       <w:pPr>
         <w:pStyle w:val="Heading3"/>
@@ -203,7 +275,7 @@
         <w:pStyle w:val="Compact"/>
         <w:numPr>
           <w:ilvl w:val="0"/>
-          <w:numId w:val="1001"/>
+          <w:numId w:val="1002"/>
         </w:numPr>
       </w:pPr>
       <w:r>
@@ -231,7 +303,7 @@
         <w:pStyle w:val="Compact"/>
         <w:numPr>
           <w:ilvl w:val="0"/>
-          <w:numId w:val="1001"/>
+          <w:numId w:val="1002"/>
         </w:numPr>
       </w:pPr>
       <w:r>
@@ -259,7 +331,7 @@
         <w:pStyle w:val="Compact"/>
         <w:numPr>
           <w:ilvl w:val="0"/>
-          <w:numId w:val="1001"/>
+          <w:numId w:val="1002"/>
         </w:numPr>
       </w:pPr>
       <w:r>
@@ -287,7 +359,7 @@
         <w:pStyle w:val="Compact"/>
         <w:numPr>
           <w:ilvl w:val="0"/>
-          <w:numId w:val="1001"/>
+          <w:numId w:val="1002"/>
         </w:numPr>
       </w:pPr>
       <w:r>
@@ -315,7 +387,7 @@
         <w:pStyle w:val="Compact"/>
         <w:numPr>
           <w:ilvl w:val="0"/>
-          <w:numId w:val="1001"/>
+          <w:numId w:val="1002"/>
         </w:numPr>
       </w:pPr>
       <w:r>
@@ -345,9 +417,9 @@
         </w:pict>
       </w:r>
     </w:p>
-    <w:bookmarkEnd w:id="9"/>
     <w:bookmarkEnd w:id="10"/>
-    <w:bookmarkStart w:id="11" w:name="Xf0ae1e9daf03770e046b8517819b3e07604077f"/>
+    <w:bookmarkEnd w:id="11"/>
+    <w:bookmarkStart w:id="12" w:name="Xf0ae1e9daf03770e046b8517819b3e07604077f"/>
     <w:p>
       <w:pPr>
         <w:pStyle w:val="Heading2"/>
@@ -667,8 +739,8 @@
         </w:pict>
       </w:r>
     </w:p>
-    <w:bookmarkEnd w:id="11"/>
-    <w:bookmarkStart w:id="13" w:name="X96cafd3db29954bdf1db173fc702295bcb518df"/>
+    <w:bookmarkEnd w:id="12"/>
+    <w:bookmarkStart w:id="14" w:name="X96cafd3db29954bdf1db173fc702295bcb518df"/>
     <w:p>
       <w:pPr>
         <w:pStyle w:val="Heading2"/>
@@ -1575,7 +1647,7 @@
         </w:tc>
       </w:tr>
     </w:tbl>
-    <w:bookmarkStart w:id="12" w:name="as-três-veias-transversais"/>
+    <w:bookmarkStart w:id="13" w:name="as-três-veias-transversais"/>
     <w:p>
       <w:pPr>
         <w:pStyle w:val="Heading3"/>
@@ -1589,7 +1661,7 @@
         <w:pStyle w:val="Compact"/>
         <w:numPr>
           <w:ilvl w:val="0"/>
-          <w:numId w:val="1002"/>
+          <w:numId w:val="1003"/>
         </w:numPr>
       </w:pPr>
       <w:r>
@@ -1617,7 +1689,7 @@
         <w:pStyle w:val="Compact"/>
         <w:numPr>
           <w:ilvl w:val="0"/>
-          <w:numId w:val="1002"/>
+          <w:numId w:val="1003"/>
         </w:numPr>
       </w:pPr>
       <w:r>
@@ -1645,7 +1717,7 @@
         <w:pStyle w:val="Compact"/>
         <w:numPr>
           <w:ilvl w:val="0"/>
-          <w:numId w:val="1002"/>
+          <w:numId w:val="1003"/>
         </w:numPr>
       </w:pPr>
       <w:r>
@@ -1675,9 +1747,9 @@
         </w:pict>
       </w:r>
     </w:p>
-    <w:bookmarkEnd w:id="12"/>
     <w:bookmarkEnd w:id="13"/>
-    <w:bookmarkStart w:id="22" w:name="X76178af1fede831451dfb6ebfb2a3fc3f9d110e"/>
+    <w:bookmarkEnd w:id="14"/>
+    <w:bookmarkStart w:id="23" w:name="X76178af1fede831451dfb6ebfb2a3fc3f9d110e"/>
     <w:p>
       <w:pPr>
         <w:pStyle w:val="Heading2"/>
@@ -1686,7 +1758,7 @@
         <w:t xml:space="preserve">4. Núcleo</w:t>
       </w:r>
     </w:p>
-    <w:bookmarkStart w:id="14" w:name="Xc4f0d9d225887b10a1aeccc6d5085aa20194839"/>
+    <w:bookmarkStart w:id="15" w:name="Xc4f0d9d225887b10a1aeccc6d5085aa20194839"/>
     <w:p>
       <w:pPr>
         <w:pStyle w:val="Heading3"/>
@@ -1700,7 +1772,7 @@
         <w:pStyle w:val="Compact"/>
         <w:numPr>
           <w:ilvl w:val="0"/>
-          <w:numId w:val="1003"/>
+          <w:numId w:val="1004"/>
         </w:numPr>
       </w:pPr>
       <w:r>
@@ -1783,7 +1855,7 @@
         <w:pStyle w:val="Compact"/>
         <w:numPr>
           <w:ilvl w:val="0"/>
-          <w:numId w:val="1003"/>
+          <w:numId w:val="1004"/>
         </w:numPr>
       </w:pPr>
       <w:r>
@@ -1834,7 +1906,7 @@
         <w:pStyle w:val="Compact"/>
         <w:numPr>
           <w:ilvl w:val="0"/>
-          <w:numId w:val="1003"/>
+          <w:numId w:val="1004"/>
         </w:numPr>
       </w:pPr>
       <w:r>
@@ -1854,8 +1926,8 @@
         <w:t xml:space="preserve">com vigência por data.</w:t>
       </w:r>
     </w:p>
-    <w:bookmarkEnd w:id="14"/>
-    <w:bookmarkStart w:id="15" w:name="X157fbb16f247f0ebc709e5d092a45f32a569731"/>
+    <w:bookmarkEnd w:id="15"/>
+    <w:bookmarkStart w:id="16" w:name="X157fbb16f247f0ebc709e5d092a45f32a569731"/>
     <w:p>
       <w:pPr>
         <w:pStyle w:val="Heading3"/>
@@ -1869,7 +1941,7 @@
         <w:pStyle w:val="Compact"/>
         <w:numPr>
           <w:ilvl w:val="0"/>
-          <w:numId w:val="1004"/>
+          <w:numId w:val="1005"/>
         </w:numPr>
       </w:pPr>
       <w:r>
@@ -1881,7 +1953,81 @@
         <w:pStyle w:val="Compact"/>
         <w:numPr>
           <w:ilvl w:val="0"/>
-          <w:numId w:val="1004"/>
+          <w:numId w:val="1005"/>
+        </w:numPr>
+      </w:pPr>
+      <w:r>
+        <w:rPr>
+          <w:b/>
+          <w:bCs/>
+        </w:rPr>
+        <w:t xml:space="preserve">Acesso por usuário × módulo, gerido pelo Admin</w:t>
+      </w:r>
+      <w:r>
+        <w:t xml:space="preserve"> </w:t>
+      </w:r>
+      <w:r>
+        <w:rPr>
+          <w:i/>
+          <w:iCs/>
+        </w:rPr>
+        <w:t xml:space="preserve">(implementado na fase 0)</w:t>
+      </w:r>
+      <w:r>
+        <w:t xml:space="preserve">:</w:t>
+      </w:r>
+      <w:r>
+        <w:t xml:space="preserve"> </w:t>
+      </w:r>
+      <w:r>
+        <w:t xml:space="preserve">o administrador atribui a cada usuário os módulos que ele pode acessar</w:t>
+      </w:r>
+      <w:r>
+        <w:t xml:space="preserve"> </w:t>
+      </w:r>
+      <w:r>
+        <w:t xml:space="preserve">(</w:t>
+      </w:r>
+      <w:r>
+        <w:rPr>
+          <w:rStyle w:val="VerbatimChar"/>
+        </w:rPr>
+        <w:t xml:space="preserve">Usuario.modulos</w:t>
+      </w:r>
+      <w:r>
+        <w:t xml:space="preserve">). Superusuário acessa todos os módulos ativos. Toda view de</w:t>
+      </w:r>
+      <w:r>
+        <w:t xml:space="preserve"> </w:t>
+      </w:r>
+      <w:r>
+        <w:t xml:space="preserve">módulo usa</w:t>
+      </w:r>
+      <w:r>
+        <w:t xml:space="preserve"> </w:t>
+      </w:r>
+      <w:r>
+        <w:rPr>
+          <w:rStyle w:val="VerbatimChar"/>
+        </w:rPr>
+        <w:t xml:space="preserve">@requer_modulo(...)</w:t>
+      </w:r>
+      <w:r>
+        <w:t xml:space="preserve">: módulo não contratado → 404; usuário sem o</w:t>
+      </w:r>
+      <w:r>
+        <w:t xml:space="preserve"> </w:t>
+      </w:r>
+      <w:r>
+        <w:t xml:space="preserve">módulo atribuído → 403. Menu e dashboard só exibem o que o usuário pode acessar.</w:t>
+      </w:r>
+    </w:p>
+    <w:p>
+      <w:pPr>
+        <w:pStyle w:val="Compact"/>
+        <w:numPr>
+          <w:ilvl w:val="0"/>
+          <w:numId w:val="1005"/>
         </w:numPr>
       </w:pPr>
       <w:r>
@@ -1892,7 +2038,10 @@
         <w:t xml:space="preserve">Perfis por módulo</w:t>
       </w:r>
       <w:r>
-        <w:t xml:space="preserve">: cada perfil define acesso por módulo e nível</w:t>
+        <w:t xml:space="preserve"> </w:t>
+      </w:r>
+      <w:r>
+        <w:t xml:space="preserve">(evolução): cada perfil define nível dentro do módulo</w:t>
       </w:r>
       <w:r>
         <w:t xml:space="preserve"> </w:t>
@@ -1912,7 +2061,7 @@
         <w:pStyle w:val="Compact"/>
         <w:numPr>
           <w:ilvl w:val="0"/>
-          <w:numId w:val="1004"/>
+          <w:numId w:val="1005"/>
         </w:numPr>
       </w:pPr>
       <w:r>
@@ -1925,8 +2074,8 @@
         <w:t xml:space="preserve">estoque) exigem nível gerência — na tela, via aprovação com senha do gerente.</w:t>
       </w:r>
     </w:p>
-    <w:bookmarkEnd w:id="15"/>
-    <w:bookmarkStart w:id="16" w:name="X2522d406979879075ac04b1f925908c2ce8af8c"/>
+    <w:bookmarkEnd w:id="16"/>
+    <w:bookmarkStart w:id="17" w:name="X2522d406979879075ac04b1f925908c2ce8af8c"/>
     <w:p>
       <w:pPr>
         <w:pStyle w:val="Heading3"/>
@@ -1940,7 +2089,7 @@
         <w:pStyle w:val="Compact"/>
         <w:numPr>
           <w:ilvl w:val="0"/>
-          <w:numId w:val="1005"/>
+          <w:numId w:val="1006"/>
         </w:numPr>
       </w:pPr>
       <w:r>
@@ -1971,7 +2120,7 @@
         <w:pStyle w:val="Compact"/>
         <w:numPr>
           <w:ilvl w:val="0"/>
-          <w:numId w:val="1005"/>
+          <w:numId w:val="1006"/>
         </w:numPr>
       </w:pPr>
       <w:r>
@@ -1996,7 +2145,7 @@
         <w:pStyle w:val="Compact"/>
         <w:numPr>
           <w:ilvl w:val="0"/>
-          <w:numId w:val="1005"/>
+          <w:numId w:val="1006"/>
         </w:numPr>
       </w:pPr>
       <w:r>
@@ -2021,7 +2170,7 @@
         <w:pStyle w:val="Compact"/>
         <w:numPr>
           <w:ilvl w:val="0"/>
-          <w:numId w:val="1005"/>
+          <w:numId w:val="1006"/>
         </w:numPr>
       </w:pPr>
       <w:r>
@@ -2046,7 +2195,7 @@
         <w:pStyle w:val="Compact"/>
         <w:numPr>
           <w:ilvl w:val="0"/>
-          <w:numId w:val="1005"/>
+          <w:numId w:val="1006"/>
         </w:numPr>
       </w:pPr>
       <w:r>
@@ -2081,7 +2230,7 @@
         <w:pStyle w:val="Compact"/>
         <w:numPr>
           <w:ilvl w:val="0"/>
-          <w:numId w:val="1005"/>
+          <w:numId w:val="1006"/>
         </w:numPr>
       </w:pPr>
       <w:r>
@@ -2095,8 +2244,8 @@
         <w:t xml:space="preserve">: título, vencimento, fornecedor/cliente, baixa.</w:t>
       </w:r>
     </w:p>
-    <w:bookmarkEnd w:id="16"/>
-    <w:bookmarkStart w:id="17" w:name="X376aacfbdd9e29ddad4259fe4f1eec7dedc23ac"/>
+    <w:bookmarkEnd w:id="17"/>
+    <w:bookmarkStart w:id="18" w:name="X376aacfbdd9e29ddad4259fe4f1eec7dedc23ac"/>
     <w:p>
       <w:pPr>
         <w:pStyle w:val="Heading3"/>
@@ -2110,7 +2259,7 @@
         <w:pStyle w:val="Compact"/>
         <w:numPr>
           <w:ilvl w:val="0"/>
-          <w:numId w:val="1006"/>
+          <w:numId w:val="1007"/>
         </w:numPr>
       </w:pPr>
       <w:r>
@@ -2135,7 +2284,7 @@
         <w:pStyle w:val="Compact"/>
         <w:numPr>
           <w:ilvl w:val="0"/>
-          <w:numId w:val="1006"/>
+          <w:numId w:val="1007"/>
         </w:numPr>
       </w:pPr>
       <w:r>
@@ -2160,7 +2309,7 @@
         <w:pStyle w:val="Compact"/>
         <w:numPr>
           <w:ilvl w:val="0"/>
-          <w:numId w:val="1006"/>
+          <w:numId w:val="1007"/>
         </w:numPr>
       </w:pPr>
       <w:r>
@@ -2200,7 +2349,7 @@
         <w:pStyle w:val="Compact"/>
         <w:numPr>
           <w:ilvl w:val="0"/>
-          <w:numId w:val="1006"/>
+          <w:numId w:val="1007"/>
         </w:numPr>
       </w:pPr>
       <w:r>
@@ -2219,15 +2368,15 @@
         <w:pStyle w:val="Compact"/>
         <w:numPr>
           <w:ilvl w:val="0"/>
-          <w:numId w:val="1006"/>
+          <w:numId w:val="1007"/>
         </w:numPr>
       </w:pPr>
       <w:r>
         <w:t xml:space="preserve">Alertas de estoque mínimo no dashboard.</w:t>
       </w:r>
     </w:p>
-    <w:bookmarkEnd w:id="17"/>
-    <w:bookmarkStart w:id="18" w:name="X61180e9543a8022f28079bf3307ca40f59ae302"/>
+    <w:bookmarkEnd w:id="18"/>
+    <w:bookmarkStart w:id="19" w:name="X61180e9543a8022f28079bf3307ca40f59ae302"/>
     <w:p>
       <w:pPr>
         <w:pStyle w:val="Heading3"/>
@@ -2241,7 +2390,7 @@
         <w:pStyle w:val="Compact"/>
         <w:numPr>
           <w:ilvl w:val="0"/>
-          <w:numId w:val="1007"/>
+          <w:numId w:val="1008"/>
         </w:numPr>
       </w:pPr>
       <w:r>
@@ -2260,7 +2409,7 @@
         <w:pStyle w:val="Compact"/>
         <w:numPr>
           <w:ilvl w:val="0"/>
-          <w:numId w:val="1007"/>
+          <w:numId w:val="1008"/>
         </w:numPr>
       </w:pPr>
       <w:r>
@@ -2329,7 +2478,7 @@
         <w:pStyle w:val="Compact"/>
         <w:numPr>
           <w:ilvl w:val="0"/>
-          <w:numId w:val="1007"/>
+          <w:numId w:val="1008"/>
         </w:numPr>
       </w:pPr>
       <w:r>
@@ -2354,7 +2503,7 @@
         <w:pStyle w:val="Compact"/>
         <w:numPr>
           <w:ilvl w:val="0"/>
-          <w:numId w:val="1007"/>
+          <w:numId w:val="1008"/>
         </w:numPr>
       </w:pPr>
       <w:r>
@@ -2377,8 +2526,8 @@
         <w:t xml:space="preserve">(restaurante) e ser fechada/transferida depois.</w:t>
       </w:r>
     </w:p>
-    <w:bookmarkEnd w:id="18"/>
-    <w:bookmarkStart w:id="19" w:name="X92422fe81d1bd629f44173b7569444d17e900d3"/>
+    <w:bookmarkEnd w:id="19"/>
+    <w:bookmarkStart w:id="20" w:name="X92422fe81d1bd629f44173b7569444d17e900d3"/>
     <w:p>
       <w:pPr>
         <w:pStyle w:val="Heading3"/>
@@ -2392,7 +2541,7 @@
         <w:pStyle w:val="Compact"/>
         <w:numPr>
           <w:ilvl w:val="0"/>
-          <w:numId w:val="1008"/>
+          <w:numId w:val="1009"/>
         </w:numPr>
       </w:pPr>
       <w:r>
@@ -2416,7 +2565,7 @@
         <w:pStyle w:val="Compact"/>
         <w:numPr>
           <w:ilvl w:val="0"/>
-          <w:numId w:val="1008"/>
+          <w:numId w:val="1009"/>
         </w:numPr>
       </w:pPr>
       <w:r>
@@ -2428,15 +2577,15 @@
         <w:pStyle w:val="Compact"/>
         <w:numPr>
           <w:ilvl w:val="0"/>
-          <w:numId w:val="1008"/>
+          <w:numId w:val="1009"/>
         </w:numPr>
       </w:pPr>
       <w:r>
         <w:t xml:space="preserve">Cada módulo contratado pluga seus relatórios no menu central.</w:t>
       </w:r>
     </w:p>
-    <w:bookmarkEnd w:id="19"/>
-    <w:bookmarkStart w:id="20" w:name="X4c7dde9679278fda1e1c2547d6db40f56130fb6"/>
+    <w:bookmarkEnd w:id="20"/>
+    <w:bookmarkStart w:id="21" w:name="X4c7dde9679278fda1e1c2547d6db40f56130fb6"/>
     <w:p>
       <w:pPr>
         <w:pStyle w:val="Heading3"/>
@@ -2450,7 +2599,7 @@
         <w:pStyle w:val="Compact"/>
         <w:numPr>
           <w:ilvl w:val="0"/>
-          <w:numId w:val="1009"/>
+          <w:numId w:val="1010"/>
         </w:numPr>
       </w:pPr>
       <w:r>
@@ -2462,15 +2611,15 @@
         <w:pStyle w:val="Compact"/>
         <w:numPr>
           <w:ilvl w:val="0"/>
-          <w:numId w:val="1009"/>
+          <w:numId w:val="1010"/>
         </w:numPr>
       </w:pPr>
       <w:r>
         <w:t xml:space="preserve">Entradas por usuário com data/hora; leitura obrigatória na abertura do turno.</w:t>
       </w:r>
     </w:p>
-    <w:bookmarkEnd w:id="20"/>
-    <w:bookmarkStart w:id="21" w:name="Xc6df8c5f52d5eca79008fb9fc4f98689977404c"/>
+    <w:bookmarkEnd w:id="21"/>
+    <w:bookmarkStart w:id="22" w:name="Xc6df8c5f52d5eca79008fb9fc4f98689977404c"/>
     <w:p>
       <w:pPr>
         <w:pStyle w:val="Heading3"/>
@@ -2484,7 +2633,7 @@
         <w:pStyle w:val="Compact"/>
         <w:numPr>
           <w:ilvl w:val="0"/>
-          <w:numId w:val="1010"/>
+          <w:numId w:val="1011"/>
         </w:numPr>
       </w:pPr>
       <w:r>
@@ -2508,7 +2657,7 @@
         <w:pStyle w:val="Compact"/>
         <w:numPr>
           <w:ilvl w:val="0"/>
-          <w:numId w:val="1010"/>
+          <w:numId w:val="1011"/>
         </w:numPr>
       </w:pPr>
       <w:r>
@@ -2522,9 +2671,9 @@
         </w:pict>
       </w:r>
     </w:p>
-    <w:bookmarkEnd w:id="21"/>
     <w:bookmarkEnd w:id="22"/>
-    <w:bookmarkStart w:id="34" w:name="X09d4db2ca8dc7d311efee3c59a8ba957e141e4a"/>
+    <w:bookmarkEnd w:id="23"/>
+    <w:bookmarkStart w:id="35" w:name="X09d4db2ca8dc7d311efee3c59a8ba957e141e4a"/>
     <w:p>
       <w:pPr>
         <w:pStyle w:val="Heading2"/>
@@ -2533,7 +2682,7 @@
         <w:t xml:space="preserve">5. Módulos — Fase 1</w:t>
       </w:r>
     </w:p>
-    <w:bookmarkStart w:id="23" w:name="Xb2a7cec07525fdb004d74996498a44dca5e2174"/>
+    <w:bookmarkStart w:id="24" w:name="Xb2a7cec07525fdb004d74996498a44dca5e2174"/>
     <w:p>
       <w:pPr>
         <w:pStyle w:val="Heading3"/>
@@ -2588,7 +2737,7 @@
         <w:pStyle w:val="Compact"/>
         <w:numPr>
           <w:ilvl w:val="0"/>
-          <w:numId w:val="1011"/>
+          <w:numId w:val="1012"/>
         </w:numPr>
       </w:pPr>
       <w:r>
@@ -2607,7 +2756,7 @@
         <w:pStyle w:val="Compact"/>
         <w:numPr>
           <w:ilvl w:val="0"/>
-          <w:numId w:val="1011"/>
+          <w:numId w:val="1012"/>
         </w:numPr>
       </w:pPr>
       <w:r>
@@ -2632,7 +2781,7 @@
         <w:pStyle w:val="Compact"/>
         <w:numPr>
           <w:ilvl w:val="0"/>
-          <w:numId w:val="1011"/>
+          <w:numId w:val="1012"/>
         </w:numPr>
       </w:pPr>
       <w:r>
@@ -2651,7 +2800,7 @@
         <w:pStyle w:val="Compact"/>
         <w:numPr>
           <w:ilvl w:val="0"/>
-          <w:numId w:val="1011"/>
+          <w:numId w:val="1012"/>
         </w:numPr>
       </w:pPr>
       <w:r>
@@ -2676,7 +2825,7 @@
         <w:pStyle w:val="Compact"/>
         <w:numPr>
           <w:ilvl w:val="0"/>
-          <w:numId w:val="1011"/>
+          <w:numId w:val="1012"/>
         </w:numPr>
       </w:pPr>
       <w:r>
@@ -2707,7 +2856,7 @@
         <w:pStyle w:val="Compact"/>
         <w:numPr>
           <w:ilvl w:val="0"/>
-          <w:numId w:val="1012"/>
+          <w:numId w:val="1013"/>
         </w:numPr>
       </w:pPr>
       <w:r>
@@ -2732,7 +2881,7 @@
         <w:pStyle w:val="Compact"/>
         <w:numPr>
           <w:ilvl w:val="0"/>
-          <w:numId w:val="1012"/>
+          <w:numId w:val="1013"/>
         </w:numPr>
       </w:pPr>
       <w:r>
@@ -2751,7 +2900,7 @@
         <w:pStyle w:val="Compact"/>
         <w:numPr>
           <w:ilvl w:val="0"/>
-          <w:numId w:val="1012"/>
+          <w:numId w:val="1013"/>
         </w:numPr>
       </w:pPr>
       <w:r>
@@ -2792,7 +2941,7 @@
         <w:pStyle w:val="Compact"/>
         <w:numPr>
           <w:ilvl w:val="0"/>
-          <w:numId w:val="1012"/>
+          <w:numId w:val="1013"/>
         </w:numPr>
       </w:pPr>
       <w:r>
@@ -2817,7 +2966,7 @@
         <w:pStyle w:val="Compact"/>
         <w:numPr>
           <w:ilvl w:val="0"/>
-          <w:numId w:val="1012"/>
+          <w:numId w:val="1013"/>
         </w:numPr>
       </w:pPr>
       <w:r>
@@ -2842,7 +2991,7 @@
         <w:pStyle w:val="Compact"/>
         <w:numPr>
           <w:ilvl w:val="0"/>
-          <w:numId w:val="1012"/>
+          <w:numId w:val="1013"/>
         </w:numPr>
       </w:pPr>
       <w:r>
@@ -2867,7 +3016,7 @@
         <w:pStyle w:val="Compact"/>
         <w:numPr>
           <w:ilvl w:val="0"/>
-          <w:numId w:val="1012"/>
+          <w:numId w:val="1013"/>
         </w:numPr>
       </w:pPr>
       <w:r>
@@ -2886,7 +3035,7 @@
         <w:pStyle w:val="Compact"/>
         <w:numPr>
           <w:ilvl w:val="0"/>
-          <w:numId w:val="1012"/>
+          <w:numId w:val="1013"/>
         </w:numPr>
       </w:pPr>
       <w:r>
@@ -2911,7 +3060,7 @@
         <w:pStyle w:val="Compact"/>
         <w:numPr>
           <w:ilvl w:val="0"/>
-          <w:numId w:val="1012"/>
+          <w:numId w:val="1013"/>
         </w:numPr>
       </w:pPr>
       <w:r>
@@ -2930,7 +3079,7 @@
         <w:pStyle w:val="Compact"/>
         <w:numPr>
           <w:ilvl w:val="0"/>
-          <w:numId w:val="1012"/>
+          <w:numId w:val="1013"/>
         </w:numPr>
       </w:pPr>
       <w:r>
@@ -2950,8 +3099,8 @@
         <w:t xml:space="preserve">contas com saldo devedor antigo, pré-reservas expiradas.</w:t>
       </w:r>
     </w:p>
-    <w:bookmarkEnd w:id="23"/>
-    <w:bookmarkStart w:id="24" w:name="Xac5197b41be6ff526615264d1dec7081a9b98b7"/>
+    <w:bookmarkEnd w:id="24"/>
+    <w:bookmarkStart w:id="25" w:name="Xac5197b41be6ff526615264d1dec7081a9b98b7"/>
     <w:p>
       <w:pPr>
         <w:pStyle w:val="Heading3"/>
@@ -2965,7 +3114,7 @@
         <w:pStyle w:val="Compact"/>
         <w:numPr>
           <w:ilvl w:val="0"/>
-          <w:numId w:val="1013"/>
+          <w:numId w:val="1014"/>
         </w:numPr>
       </w:pPr>
       <w:r>
@@ -2996,7 +3145,7 @@
         <w:pStyle w:val="Compact"/>
         <w:numPr>
           <w:ilvl w:val="0"/>
-          <w:numId w:val="1013"/>
+          <w:numId w:val="1014"/>
         </w:numPr>
       </w:pPr>
       <w:r>
@@ -3027,7 +3176,7 @@
         <w:pStyle w:val="Compact"/>
         <w:numPr>
           <w:ilvl w:val="0"/>
-          <w:numId w:val="1013"/>
+          <w:numId w:val="1014"/>
         </w:numPr>
       </w:pPr>
       <w:r>
@@ -3045,15 +3194,15 @@
         <w:pStyle w:val="Compact"/>
         <w:numPr>
           <w:ilvl w:val="0"/>
-          <w:numId w:val="1013"/>
+          <w:numId w:val="1014"/>
         </w:numPr>
       </w:pPr>
       <w:r>
         <w:t xml:space="preserve">Integração Lavanderia: faxina gera coleta de enxoval sujo e requisição de limpo.</w:t>
       </w:r>
     </w:p>
-    <w:bookmarkEnd w:id="24"/>
-    <w:bookmarkStart w:id="25" w:name="Xe5cfa7f5f09cf4ea6333cb90662ecfa1d02727e"/>
+    <w:bookmarkEnd w:id="25"/>
+    <w:bookmarkStart w:id="26" w:name="Xe5cfa7f5f09cf4ea6333cb90662ecfa1d02727e"/>
     <w:p>
       <w:pPr>
         <w:pStyle w:val="Heading3"/>
@@ -3067,7 +3216,7 @@
         <w:pStyle w:val="Compact"/>
         <w:numPr>
           <w:ilvl w:val="0"/>
-          <w:numId w:val="1014"/>
+          <w:numId w:val="1015"/>
         </w:numPr>
       </w:pPr>
       <w:r>
@@ -3092,7 +3241,7 @@
         <w:pStyle w:val="Compact"/>
         <w:numPr>
           <w:ilvl w:val="0"/>
-          <w:numId w:val="1014"/>
+          <w:numId w:val="1015"/>
         </w:numPr>
       </w:pPr>
       <w:r>
@@ -3114,7 +3263,7 @@
         <w:pStyle w:val="Compact"/>
         <w:numPr>
           <w:ilvl w:val="0"/>
-          <w:numId w:val="1014"/>
+          <w:numId w:val="1015"/>
         </w:numPr>
       </w:pPr>
       <w:r>
@@ -3137,8 +3286,8 @@
         <w:t xml:space="preserve">6 meses) — agenda automática.</w:t>
       </w:r>
     </w:p>
-    <w:bookmarkEnd w:id="25"/>
-    <w:bookmarkStart w:id="26" w:name="X8c71006aa45fe932153832b195a62989f73290f"/>
+    <w:bookmarkEnd w:id="26"/>
+    <w:bookmarkStart w:id="27" w:name="X8c71006aa45fe932153832b195a62989f73290f"/>
     <w:p>
       <w:pPr>
         <w:pStyle w:val="Heading3"/>
@@ -3152,7 +3301,7 @@
         <w:pStyle w:val="Compact"/>
         <w:numPr>
           <w:ilvl w:val="0"/>
-          <w:numId w:val="1015"/>
+          <w:numId w:val="1016"/>
         </w:numPr>
       </w:pPr>
       <w:r>
@@ -3174,7 +3323,7 @@
         <w:pStyle w:val="Compact"/>
         <w:numPr>
           <w:ilvl w:val="0"/>
-          <w:numId w:val="1015"/>
+          <w:numId w:val="1016"/>
         </w:numPr>
       </w:pPr>
       <w:r>
@@ -3199,7 +3348,7 @@
         <w:pStyle w:val="Compact"/>
         <w:numPr>
           <w:ilvl w:val="0"/>
-          <w:numId w:val="1015"/>
+          <w:numId w:val="1016"/>
         </w:numPr>
       </w:pPr>
       <w:r>
@@ -3211,15 +3360,15 @@
         <w:pStyle w:val="Compact"/>
         <w:numPr>
           <w:ilvl w:val="0"/>
-          <w:numId w:val="1015"/>
+          <w:numId w:val="1016"/>
         </w:numPr>
       </w:pPr>
       <w:r>
         <w:t xml:space="preserve">Integração: tarefas de Governança/Manutenção atribuíveis a quem está de turno.</w:t>
       </w:r>
     </w:p>
-    <w:bookmarkEnd w:id="26"/>
-    <w:bookmarkStart w:id="27" w:name="Xc3aaa172dd546859e46f6788e60597a6e806ce3"/>
+    <w:bookmarkEnd w:id="27"/>
+    <w:bookmarkStart w:id="28" w:name="Xc3aaa172dd546859e46f6788e60597a6e806ce3"/>
     <w:p>
       <w:pPr>
         <w:pStyle w:val="Heading3"/>
@@ -3233,7 +3382,7 @@
         <w:pStyle w:val="Compact"/>
         <w:numPr>
           <w:ilvl w:val="0"/>
-          <w:numId w:val="1016"/>
+          <w:numId w:val="1017"/>
         </w:numPr>
       </w:pPr>
       <w:r>
@@ -3251,7 +3400,7 @@
         <w:pStyle w:val="Compact"/>
         <w:numPr>
           <w:ilvl w:val="0"/>
-          <w:numId w:val="1016"/>
+          <w:numId w:val="1017"/>
         </w:numPr>
       </w:pPr>
       <w:r>
@@ -3264,8 +3413,8 @@
         <w:t xml:space="preserve">custo do estoque.</w:t>
       </w:r>
     </w:p>
-    <w:bookmarkEnd w:id="27"/>
-    <w:bookmarkStart w:id="28" w:name="Xb9ab7dfa97e6209dbe788855a7071a24a41a043"/>
+    <w:bookmarkEnd w:id="28"/>
+    <w:bookmarkStart w:id="29" w:name="Xb9ab7dfa97e6209dbe788855a7071a24a41a043"/>
     <w:p>
       <w:pPr>
         <w:pStyle w:val="Heading3"/>
@@ -3279,7 +3428,7 @@
         <w:pStyle w:val="Compact"/>
         <w:numPr>
           <w:ilvl w:val="0"/>
-          <w:numId w:val="1017"/>
+          <w:numId w:val="1018"/>
         </w:numPr>
       </w:pPr>
       <w:r>
@@ -3320,7 +3469,7 @@
         <w:pStyle w:val="Compact"/>
         <w:numPr>
           <w:ilvl w:val="0"/>
-          <w:numId w:val="1017"/>
+          <w:numId w:val="1018"/>
         </w:numPr>
       </w:pPr>
       <w:r>
@@ -3348,7 +3497,7 @@
         <w:pStyle w:val="Compact"/>
         <w:numPr>
           <w:ilvl w:val="0"/>
-          <w:numId w:val="1017"/>
+          <w:numId w:val="1018"/>
         </w:numPr>
       </w:pPr>
       <w:r>
@@ -3360,7 +3509,7 @@
         <w:pStyle w:val="Compact"/>
         <w:numPr>
           <w:ilvl w:val="0"/>
-          <w:numId w:val="1017"/>
+          <w:numId w:val="1018"/>
         </w:numPr>
       </w:pPr>
       <w:r>
@@ -3383,8 +3532,8 @@
         <w:t xml:space="preserve">(preço − custo médio), curva ABC.</w:t>
       </w:r>
     </w:p>
-    <w:bookmarkEnd w:id="28"/>
-    <w:bookmarkStart w:id="29" w:name="Xd2727a2387a3a63690b31112c4b73e0e2b0d601"/>
+    <w:bookmarkEnd w:id="29"/>
+    <w:bookmarkStart w:id="30" w:name="Xd2727a2387a3a63690b31112c4b73e0e2b0d601"/>
     <w:p>
       <w:pPr>
         <w:pStyle w:val="Heading3"/>
@@ -3398,7 +3547,7 @@
         <w:pStyle w:val="Compact"/>
         <w:numPr>
           <w:ilvl w:val="0"/>
-          <w:numId w:val="1018"/>
+          <w:numId w:val="1019"/>
         </w:numPr>
       </w:pPr>
       <w:r>
@@ -3417,7 +3566,7 @@
         <w:pStyle w:val="Compact"/>
         <w:numPr>
           <w:ilvl w:val="0"/>
-          <w:numId w:val="1018"/>
+          <w:numId w:val="1019"/>
         </w:numPr>
       </w:pPr>
       <w:r>
@@ -3448,7 +3597,7 @@
         <w:pStyle w:val="Compact"/>
         <w:numPr>
           <w:ilvl w:val="0"/>
-          <w:numId w:val="1018"/>
+          <w:numId w:val="1019"/>
         </w:numPr>
       </w:pPr>
       <w:r>
@@ -3466,7 +3615,7 @@
         <w:pStyle w:val="Compact"/>
         <w:numPr>
           <w:ilvl w:val="0"/>
-          <w:numId w:val="1018"/>
+          <w:numId w:val="1019"/>
         </w:numPr>
       </w:pPr>
       <w:r>
@@ -3494,15 +3643,15 @@
         <w:pStyle w:val="Compact"/>
         <w:numPr>
           <w:ilvl w:val="0"/>
-          <w:numId w:val="1018"/>
+          <w:numId w:val="1019"/>
         </w:numPr>
       </w:pPr>
       <w:r>
         <w:t xml:space="preserve">Caixa próprio por operador do restaurante.</w:t>
       </w:r>
     </w:p>
-    <w:bookmarkEnd w:id="29"/>
-    <w:bookmarkStart w:id="30" w:name="X87ac80cbd4c71d9fdad196e550e4e6c51f4f328"/>
+    <w:bookmarkEnd w:id="30"/>
+    <w:bookmarkStart w:id="31" w:name="X87ac80cbd4c71d9fdad196e550e4e6c51f4f328"/>
     <w:p>
       <w:pPr>
         <w:pStyle w:val="Heading3"/>
@@ -3528,7 +3677,7 @@
         <w:pStyle w:val="Compact"/>
         <w:numPr>
           <w:ilvl w:val="0"/>
-          <w:numId w:val="1019"/>
+          <w:numId w:val="1020"/>
         </w:numPr>
       </w:pPr>
       <w:r>
@@ -3558,7 +3707,7 @@
         <w:pStyle w:val="Compact"/>
         <w:numPr>
           <w:ilvl w:val="0"/>
-          <w:numId w:val="1020"/>
+          <w:numId w:val="1021"/>
         </w:numPr>
       </w:pPr>
       <w:r>
@@ -3583,7 +3732,7 @@
         <w:pStyle w:val="Compact"/>
         <w:numPr>
           <w:ilvl w:val="0"/>
-          <w:numId w:val="1020"/>
+          <w:numId w:val="1021"/>
         </w:numPr>
       </w:pPr>
       <w:r>
@@ -3608,7 +3757,7 @@
         <w:pStyle w:val="Compact"/>
         <w:numPr>
           <w:ilvl w:val="0"/>
-          <w:numId w:val="1020"/>
+          <w:numId w:val="1021"/>
         </w:numPr>
       </w:pPr>
       <w:r>
@@ -3620,15 +3769,15 @@
         <w:pStyle w:val="Compact"/>
         <w:numPr>
           <w:ilvl w:val="0"/>
-          <w:numId w:val="1020"/>
+          <w:numId w:val="1021"/>
         </w:numPr>
       </w:pPr>
       <w:r>
         <w:t xml:space="preserve">Consumo de insumos de lavagem via Estoque.</w:t>
       </w:r>
     </w:p>
-    <w:bookmarkEnd w:id="30"/>
-    <w:bookmarkStart w:id="31" w:name="X3854ce501b8eb68e5b14109771a517025dc6ba7"/>
+    <w:bookmarkEnd w:id="31"/>
+    <w:bookmarkStart w:id="32" w:name="X3854ce501b8eb68e5b14109771a517025dc6ba7"/>
     <w:p>
       <w:pPr>
         <w:pStyle w:val="Heading3"/>
@@ -3642,7 +3791,7 @@
         <w:pStyle w:val="Compact"/>
         <w:numPr>
           <w:ilvl w:val="0"/>
-          <w:numId w:val="1021"/>
+          <w:numId w:val="1022"/>
         </w:numPr>
       </w:pPr>
       <w:r>
@@ -3661,7 +3810,7 @@
         <w:pStyle w:val="Compact"/>
         <w:numPr>
           <w:ilvl w:val="0"/>
-          <w:numId w:val="1021"/>
+          <w:numId w:val="1022"/>
         </w:numPr>
       </w:pPr>
       <w:r>
@@ -3686,7 +3835,7 @@
         <w:pStyle w:val="Compact"/>
         <w:numPr>
           <w:ilvl w:val="0"/>
-          <w:numId w:val="1021"/>
+          <w:numId w:val="1022"/>
         </w:numPr>
       </w:pPr>
       <w:r>
@@ -3698,15 +3847,15 @@
         <w:pStyle w:val="Compact"/>
         <w:numPr>
           <w:ilvl w:val="0"/>
-          <w:numId w:val="1021"/>
+          <w:numId w:val="1022"/>
         </w:numPr>
       </w:pPr>
       <w:r>
         <w:t xml:space="preserve">Check-out bloqueado até conferência do frigobar (configurável).</w:t>
       </w:r>
     </w:p>
-    <w:bookmarkEnd w:id="31"/>
-    <w:bookmarkStart w:id="32" w:name="X371c7c7432cd8353e0e17bfe4cdd4814597d95e"/>
+    <w:bookmarkEnd w:id="32"/>
+    <w:bookmarkStart w:id="33" w:name="X371c7c7432cd8353e0e17bfe4cdd4814597d95e"/>
     <w:p>
       <w:pPr>
         <w:pStyle w:val="Heading3"/>
@@ -3720,7 +3869,7 @@
         <w:pStyle w:val="Compact"/>
         <w:numPr>
           <w:ilvl w:val="0"/>
-          <w:numId w:val="1022"/>
+          <w:numId w:val="1023"/>
         </w:numPr>
       </w:pPr>
       <w:r>
@@ -3790,7 +3939,7 @@
         <w:pStyle w:val="Compact"/>
         <w:numPr>
           <w:ilvl w:val="0"/>
-          <w:numId w:val="1022"/>
+          <w:numId w:val="1023"/>
         </w:numPr>
       </w:pPr>
       <w:r>
@@ -3808,7 +3957,7 @@
         <w:pStyle w:val="Compact"/>
         <w:numPr>
           <w:ilvl w:val="0"/>
-          <w:numId w:val="1022"/>
+          <w:numId w:val="1023"/>
         </w:numPr>
       </w:pPr>
       <w:r>
@@ -3827,7 +3976,7 @@
         <w:pStyle w:val="Compact"/>
         <w:numPr>
           <w:ilvl w:val="0"/>
-          <w:numId w:val="1022"/>
+          <w:numId w:val="1023"/>
         </w:numPr>
       </w:pPr>
       <w:r>
@@ -3849,7 +3998,7 @@
         <w:pStyle w:val="Compact"/>
         <w:numPr>
           <w:ilvl w:val="0"/>
-          <w:numId w:val="1022"/>
+          <w:numId w:val="1023"/>
         </w:numPr>
       </w:pPr>
       <w:r>
@@ -3863,8 +4012,8 @@
         <w:t xml:space="preserve">: transações do gateway × lançamentos do sistema.</w:t>
       </w:r>
     </w:p>
-    <w:bookmarkEnd w:id="32"/>
-    <w:bookmarkStart w:id="33" w:name="X071fd21f88b3dda67d6aa121f82dd3255b578ef"/>
+    <w:bookmarkEnd w:id="33"/>
+    <w:bookmarkStart w:id="34" w:name="X071fd21f88b3dda67d6aa121f82dd3255b578ef"/>
     <w:p>
       <w:pPr>
         <w:pStyle w:val="Heading3"/>
@@ -3914,7 +4063,7 @@
         <w:pStyle w:val="Compact"/>
         <w:numPr>
           <w:ilvl w:val="0"/>
-          <w:numId w:val="1023"/>
+          <w:numId w:val="1024"/>
         </w:numPr>
       </w:pPr>
       <w:r>
@@ -3926,7 +4075,7 @@
         <w:pStyle w:val="Compact"/>
         <w:numPr>
           <w:ilvl w:val="0"/>
-          <w:numId w:val="1023"/>
+          <w:numId w:val="1024"/>
         </w:numPr>
       </w:pPr>
       <w:r>
@@ -3972,7 +4121,7 @@
         <w:pStyle w:val="Compact"/>
         <w:numPr>
           <w:ilvl w:val="0"/>
-          <w:numId w:val="1024"/>
+          <w:numId w:val="1025"/>
         </w:numPr>
       </w:pPr>
       <w:r>
@@ -3984,7 +4133,7 @@
         <w:pStyle w:val="Compact"/>
         <w:numPr>
           <w:ilvl w:val="0"/>
-          <w:numId w:val="1024"/>
+          <w:numId w:val="1025"/>
         </w:numPr>
       </w:pPr>
       <w:r>
@@ -3996,7 +4145,7 @@
         <w:pStyle w:val="Compact"/>
         <w:numPr>
           <w:ilvl w:val="0"/>
-          <w:numId w:val="1024"/>
+          <w:numId w:val="1025"/>
         </w:numPr>
       </w:pPr>
       <w:r>
@@ -4008,7 +4157,7 @@
         <w:pStyle w:val="Compact"/>
         <w:numPr>
           <w:ilvl w:val="0"/>
-          <w:numId w:val="1024"/>
+          <w:numId w:val="1025"/>
         </w:numPr>
       </w:pPr>
       <w:r>
@@ -4043,9 +4192,9 @@
         </w:pict>
       </w:r>
     </w:p>
-    <w:bookmarkEnd w:id="33"/>
     <w:bookmarkEnd w:id="34"/>
-    <w:bookmarkStart w:id="35" w:name="Xeac845c60dcbf54c28b3f9a98796b4903dc944b"/>
+    <w:bookmarkEnd w:id="35"/>
+    <w:bookmarkStart w:id="36" w:name="Xeac845c60dcbf54c28b3f9a98796b4903dc944b"/>
     <w:p>
       <w:pPr>
         <w:pStyle w:val="Heading2"/>
@@ -4207,8 +4356,8 @@
         </w:pict>
       </w:r>
     </w:p>
-    <w:bookmarkEnd w:id="35"/>
-    <w:bookmarkStart w:id="36" w:name="Xa0f7e5d8f1403d976a03f3b009a8db8beabb082"/>
+    <w:bookmarkEnd w:id="36"/>
+    <w:bookmarkStart w:id="37" w:name="Xa0f7e5d8f1403d976a03f3b009a8db8beabb082"/>
     <w:p>
       <w:pPr>
         <w:pStyle w:val="Heading2"/>
@@ -4485,7 +4634,7 @@
         <w:pStyle w:val="Compact"/>
         <w:numPr>
           <w:ilvl w:val="0"/>
-          <w:numId w:val="1025"/>
+          <w:numId w:val="1026"/>
         </w:numPr>
       </w:pPr>
       <w:r>
@@ -4509,7 +4658,7 @@
         <w:pStyle w:val="Compact"/>
         <w:numPr>
           <w:ilvl w:val="0"/>
-          <w:numId w:val="1025"/>
+          <w:numId w:val="1026"/>
         </w:numPr>
       </w:pPr>
       <w:r>
@@ -4548,7 +4697,7 @@
         <w:pStyle w:val="Compact"/>
         <w:numPr>
           <w:ilvl w:val="0"/>
-          <w:numId w:val="1025"/>
+          <w:numId w:val="1026"/>
         </w:numPr>
       </w:pPr>
       <w:r>
@@ -4575,7 +4724,7 @@
         <w:pStyle w:val="Compact"/>
         <w:numPr>
           <w:ilvl w:val="0"/>
-          <w:numId w:val="1025"/>
+          <w:numId w:val="1026"/>
         </w:numPr>
       </w:pPr>
       <w:r>
@@ -4601,8 +4750,8 @@
         </w:pict>
       </w:r>
     </w:p>
-    <w:bookmarkEnd w:id="36"/>
-    <w:bookmarkStart w:id="37" w:name="X179fea87acab55f93951e2de9f0e6e8966640af"/>
+    <w:bookmarkEnd w:id="37"/>
+    <w:bookmarkStart w:id="38" w:name="X179fea87acab55f93951e2de9f0e6e8966640af"/>
     <w:p>
       <w:pPr>
         <w:pStyle w:val="Heading2"/>
@@ -4652,7 +4801,7 @@
         <w:pStyle w:val="Compact"/>
         <w:numPr>
           <w:ilvl w:val="0"/>
-          <w:numId w:val="1026"/>
+          <w:numId w:val="1027"/>
         </w:numPr>
       </w:pPr>
       <w:r>
@@ -4671,7 +4820,7 @@
         <w:pStyle w:val="Compact"/>
         <w:numPr>
           <w:ilvl w:val="0"/>
-          <w:numId w:val="1026"/>
+          <w:numId w:val="1027"/>
         </w:numPr>
       </w:pPr>
       <w:r>
@@ -4690,7 +4839,7 @@
         <w:pStyle w:val="Compact"/>
         <w:numPr>
           <w:ilvl w:val="0"/>
-          <w:numId w:val="1026"/>
+          <w:numId w:val="1027"/>
         </w:numPr>
       </w:pPr>
       <w:r>
@@ -4709,7 +4858,7 @@
         <w:pStyle w:val="Compact"/>
         <w:numPr>
           <w:ilvl w:val="0"/>
-          <w:numId w:val="1026"/>
+          <w:numId w:val="1027"/>
         </w:numPr>
       </w:pPr>
       <w:r>
@@ -4728,7 +4877,7 @@
         <w:pStyle w:val="Compact"/>
         <w:numPr>
           <w:ilvl w:val="0"/>
-          <w:numId w:val="1026"/>
+          <w:numId w:val="1027"/>
         </w:numPr>
       </w:pPr>
       <w:r>
@@ -4747,7 +4896,7 @@
         <w:pStyle w:val="Compact"/>
         <w:numPr>
           <w:ilvl w:val="0"/>
-          <w:numId w:val="1026"/>
+          <w:numId w:val="1027"/>
         </w:numPr>
       </w:pPr>
       <w:r>
@@ -4766,7 +4915,7 @@
         <w:pStyle w:val="Compact"/>
         <w:numPr>
           <w:ilvl w:val="0"/>
-          <w:numId w:val="1026"/>
+          <w:numId w:val="1027"/>
         </w:numPr>
       </w:pPr>
       <w:r>
@@ -4785,7 +4934,7 @@
         <w:pStyle w:val="Compact"/>
         <w:numPr>
           <w:ilvl w:val="0"/>
-          <w:numId w:val="1026"/>
+          <w:numId w:val="1027"/>
         </w:numPr>
       </w:pPr>
       <w:r>
@@ -4804,7 +4953,7 @@
         <w:pStyle w:val="Compact"/>
         <w:numPr>
           <w:ilvl w:val="0"/>
-          <w:numId w:val="1026"/>
+          <w:numId w:val="1027"/>
         </w:numPr>
       </w:pPr>
       <w:r>
@@ -4823,7 +4972,7 @@
         <w:pStyle w:val="Compact"/>
         <w:numPr>
           <w:ilvl w:val="0"/>
-          <w:numId w:val="1026"/>
+          <w:numId w:val="1027"/>
         </w:numPr>
       </w:pPr>
       <w:r>
@@ -4842,7 +4991,7 @@
         <w:pStyle w:val="Compact"/>
         <w:numPr>
           <w:ilvl w:val="0"/>
-          <w:numId w:val="1026"/>
+          <w:numId w:val="1027"/>
         </w:numPr>
       </w:pPr>
       <w:r>
@@ -4959,8 +5108,8 @@
         </w:pict>
       </w:r>
     </w:p>
-    <w:bookmarkEnd w:id="37"/>
-    <w:bookmarkStart w:id="38" w:name="X74dcf37c9d3e36cab1503b975ea81570236180e"/>
+    <w:bookmarkEnd w:id="38"/>
+    <w:bookmarkStart w:id="39" w:name="X74dcf37c9d3e36cab1503b975ea81570236180e"/>
     <w:p>
       <w:pPr>
         <w:pStyle w:val="Heading2"/>
@@ -5446,8 +5595,8 @@
         </w:pict>
       </w:r>
     </w:p>
-    <w:bookmarkEnd w:id="38"/>
-    <w:bookmarkStart w:id="39" w:name="Xbb1cbac2d4078e3944bd2035b47473c9285c6fe"/>
+    <w:bookmarkEnd w:id="39"/>
+    <w:bookmarkStart w:id="40" w:name="Xbb1cbac2d4078e3944bd2035b47473c9285c6fe"/>
     <w:p>
       <w:pPr>
         <w:pStyle w:val="Heading2"/>
@@ -5461,7 +5610,7 @@
         <w:pStyle w:val="Compact"/>
         <w:numPr>
           <w:ilvl w:val="0"/>
-          <w:numId w:val="1027"/>
+          <w:numId w:val="1028"/>
         </w:numPr>
       </w:pPr>
       <w:r>
@@ -5473,7 +5622,7 @@
         <w:pStyle w:val="Compact"/>
         <w:numPr>
           <w:ilvl w:val="0"/>
-          <w:numId w:val="1027"/>
+          <w:numId w:val="1028"/>
         </w:numPr>
       </w:pPr>
       <w:r>
@@ -5485,7 +5634,7 @@
         <w:pStyle w:val="Compact"/>
         <w:numPr>
           <w:ilvl w:val="0"/>
-          <w:numId w:val="1027"/>
+          <w:numId w:val="1028"/>
         </w:numPr>
       </w:pPr>
       <w:r>
@@ -5512,7 +5661,7 @@
         <w:pStyle w:val="Compact"/>
         <w:numPr>
           <w:ilvl w:val="0"/>
-          <w:numId w:val="1027"/>
+          <w:numId w:val="1028"/>
         </w:numPr>
       </w:pPr>
       <w:r>
@@ -5539,7 +5688,7 @@
         <w:pStyle w:val="Compact"/>
         <w:numPr>
           <w:ilvl w:val="0"/>
-          <w:numId w:val="1027"/>
+          <w:numId w:val="1028"/>
         </w:numPr>
       </w:pPr>
       <w:r>
@@ -5551,15 +5700,15 @@
         <w:pStyle w:val="Compact"/>
         <w:numPr>
           <w:ilvl w:val="0"/>
-          <w:numId w:val="1027"/>
+          <w:numId w:val="1028"/>
         </w:numPr>
       </w:pPr>
       <w:r>
         <w:t xml:space="preserve">LGPD: dados de hóspedes minimizados, acesso auditado, retenção definida.</w:t>
       </w:r>
     </w:p>
-    <w:bookmarkEnd w:id="39"/>
     <w:bookmarkEnd w:id="40"/>
+    <w:bookmarkEnd w:id="41"/>
     <w:sectPr>
       <w:footnotePr>
         <w:numRestart w:val="eachSect"/>
@@ -5670,6 +5819,109 @@
       </w:pPr>
     </w:lvl>
   </w:abstractNum>
+  <w:abstractNum w:abstractNumId="991">
+    <w:nsid w:val="0000A991"/>
+    <w:multiLevelType w:val="multilevel"/>
+    <w:lvl w:ilvl="0">
+      <w:numFmt w:val="bullet"/>
+      <w:lvlText w:val=""/>
+      <w:lvlJc w:val="left"/>
+      <w:pPr>
+        <w:ind w:left="720" w:hanging="360"/>
+      </w:pPr>
+      <w:rPr>
+        <w:rFonts w:ascii="Symbol" w:hAnsi="Symbol" w:cs="Symbol" w:hint="default"/>
+      </w:rPr>
+    </w:lvl>
+    <w:lvl w:ilvl="1">
+      <w:numFmt w:val="bullet"/>
+      <w:lvlText w:val="o"/>
+      <w:lvlJc w:val="left"/>
+      <w:pPr>
+        <w:ind w:left="1440" w:hanging="360"/>
+      </w:pPr>
+      <w:rPr>
+        <w:rFonts w:ascii="Courier New" w:hAnsi="Courier New" w:cs="Courier New" w:hint="default"/>
+      </w:rPr>
+    </w:lvl>
+    <w:lvl w:ilvl="2">
+      <w:numFmt w:val="bullet"/>
+      <w:lvlText w:val=""/>
+      <w:lvlJc w:val="left"/>
+      <w:pPr>
+        <w:ind w:left="2160" w:hanging="360"/>
+      </w:pPr>
+      <w:rPr>
+        <w:rFonts w:ascii="Wingdings" w:hAnsi="Wingdings" w:cs="Wingdings" w:hint="default"/>
+      </w:rPr>
+    </w:lvl>
+    <w:lvl w:ilvl="3">
+      <w:numFmt w:val="bullet"/>
+      <w:lvlText w:val=""/>
+      <w:lvlJc w:val="left"/>
+      <w:pPr>
+        <w:ind w:left="2880" w:hanging="360"/>
+      </w:pPr>
+      <w:rPr>
+        <w:rFonts w:ascii="Symbol" w:hAnsi="Symbol" w:cs="Symbol" w:hint="default"/>
+      </w:rPr>
+    </w:lvl>
+    <w:lvl w:ilvl="4">
+      <w:numFmt w:val="bullet"/>
+      <w:lvlText w:val="o"/>
+      <w:lvlJc w:val="left"/>
+      <w:pPr>
+        <w:ind w:left="3600" w:hanging="360"/>
+      </w:pPr>
+      <w:rPr>
+        <w:rFonts w:ascii="Courier New" w:hAnsi="Courier New" w:cs="Courier New" w:hint="default"/>
+      </w:rPr>
+    </w:lvl>
+    <w:lvl w:ilvl="5">
+      <w:numFmt w:val="bullet"/>
+      <w:lvlText w:val=""/>
+      <w:lvlJc w:val="left"/>
+      <w:pPr>
+        <w:ind w:left="4320" w:hanging="360"/>
+      </w:pPr>
+      <w:rPr>
+        <w:rFonts w:ascii="Wingdings" w:hAnsi="Wingdings" w:cs="Wingdings" w:hint="default"/>
+      </w:rPr>
+    </w:lvl>
+    <w:lvl w:ilvl="6">
+      <w:numFmt w:val="bullet"/>
+      <w:lvlText w:val=""/>
+      <w:lvlJc w:val="left"/>
+      <w:pPr>
+        <w:ind w:left="5040" w:hanging="360"/>
+      </w:pPr>
+      <w:rPr>
+        <w:rFonts w:ascii="Symbol" w:hAnsi="Symbol" w:cs="Symbol" w:hint="default"/>
+      </w:rPr>
+    </w:lvl>
+    <w:lvl w:ilvl="7">
+      <w:numFmt w:val="bullet"/>
+      <w:lvlText w:val="o"/>
+      <w:lvlJc w:val="left"/>
+      <w:pPr>
+        <w:ind w:left="5760" w:hanging="360"/>
+      </w:pPr>
+      <w:rPr>
+        <w:rFonts w:ascii="Courier New" w:hAnsi="Courier New" w:cs="Courier New" w:hint="default"/>
+      </w:rPr>
+    </w:lvl>
+    <w:lvl w:ilvl="8">
+      <w:numFmt w:val="bullet"/>
+      <w:lvlText w:val=""/>
+      <w:lvlJc w:val="left"/>
+      <w:pPr>
+        <w:ind w:left="6480" w:hanging="360"/>
+      </w:pPr>
+      <w:rPr>
+        <w:rFonts w:ascii="Wingdings" w:hAnsi="Wingdings" w:cs="Wingdings" w:hint="default"/>
+      </w:rPr>
+    </w:lvl>
+  </w:abstractNum>
   <w:abstractNum w:abstractNumId="99411">
     <w:nsid w:val="00A99411"/>
     <w:multiLevelType w:val="multilevel"/>
@@ -5755,141 +6007,11 @@
       </w:pPr>
     </w:lvl>
   </w:abstractNum>
-  <w:abstractNum w:abstractNumId="991">
-    <w:nsid w:val="0000A991"/>
-    <w:multiLevelType w:val="multilevel"/>
-    <w:lvl w:ilvl="0">
-      <w:numFmt w:val="bullet"/>
-      <w:lvlText w:val=""/>
-      <w:lvlJc w:val="left"/>
-      <w:pPr>
-        <w:ind w:left="720" w:hanging="360"/>
-      </w:pPr>
-      <w:rPr>
-        <w:rFonts w:ascii="Symbol" w:hAnsi="Symbol" w:cs="Symbol" w:hint="default"/>
-      </w:rPr>
-    </w:lvl>
-    <w:lvl w:ilvl="1">
-      <w:numFmt w:val="bullet"/>
-      <w:lvlText w:val="o"/>
-      <w:lvlJc w:val="left"/>
-      <w:pPr>
-        <w:ind w:left="1440" w:hanging="360"/>
-      </w:pPr>
-      <w:rPr>
-        <w:rFonts w:ascii="Courier New" w:hAnsi="Courier New" w:cs="Courier New" w:hint="default"/>
-      </w:rPr>
-    </w:lvl>
-    <w:lvl w:ilvl="2">
-      <w:numFmt w:val="bullet"/>
-      <w:lvlText w:val=""/>
-      <w:lvlJc w:val="left"/>
-      <w:pPr>
-        <w:ind w:left="2160" w:hanging="360"/>
-      </w:pPr>
-      <w:rPr>
-        <w:rFonts w:ascii="Wingdings" w:hAnsi="Wingdings" w:cs="Wingdings" w:hint="default"/>
-      </w:rPr>
-    </w:lvl>
-    <w:lvl w:ilvl="3">
-      <w:numFmt w:val="bullet"/>
-      <w:lvlText w:val=""/>
-      <w:lvlJc w:val="left"/>
-      <w:pPr>
-        <w:ind w:left="2880" w:hanging="360"/>
-      </w:pPr>
-      <w:rPr>
-        <w:rFonts w:ascii="Symbol" w:hAnsi="Symbol" w:cs="Symbol" w:hint="default"/>
-      </w:rPr>
-    </w:lvl>
-    <w:lvl w:ilvl="4">
-      <w:numFmt w:val="bullet"/>
-      <w:lvlText w:val="o"/>
-      <w:lvlJc w:val="left"/>
-      <w:pPr>
-        <w:ind w:left="3600" w:hanging="360"/>
-      </w:pPr>
-      <w:rPr>
-        <w:rFonts w:ascii="Courier New" w:hAnsi="Courier New" w:cs="Courier New" w:hint="default"/>
-      </w:rPr>
-    </w:lvl>
-    <w:lvl w:ilvl="5">
-      <w:numFmt w:val="bullet"/>
-      <w:lvlText w:val=""/>
-      <w:lvlJc w:val="left"/>
-      <w:pPr>
-        <w:ind w:left="4320" w:hanging="360"/>
-      </w:pPr>
-      <w:rPr>
-        <w:rFonts w:ascii="Wingdings" w:hAnsi="Wingdings" w:cs="Wingdings" w:hint="default"/>
-      </w:rPr>
-    </w:lvl>
-    <w:lvl w:ilvl="6">
-      <w:numFmt w:val="bullet"/>
-      <w:lvlText w:val=""/>
-      <w:lvlJc w:val="left"/>
-      <w:pPr>
-        <w:ind w:left="5040" w:hanging="360"/>
-      </w:pPr>
-      <w:rPr>
-        <w:rFonts w:ascii="Symbol" w:hAnsi="Symbol" w:cs="Symbol" w:hint="default"/>
-      </w:rPr>
-    </w:lvl>
-    <w:lvl w:ilvl="7">
-      <w:numFmt w:val="bullet"/>
-      <w:lvlText w:val="o"/>
-      <w:lvlJc w:val="left"/>
-      <w:pPr>
-        <w:ind w:left="5760" w:hanging="360"/>
-      </w:pPr>
-      <w:rPr>
-        <w:rFonts w:ascii="Courier New" w:hAnsi="Courier New" w:cs="Courier New" w:hint="default"/>
-      </w:rPr>
-    </w:lvl>
-    <w:lvl w:ilvl="8">
-      <w:numFmt w:val="bullet"/>
-      <w:lvlText w:val=""/>
-      <w:lvlJc w:val="left"/>
-      <w:pPr>
-        <w:ind w:left="6480" w:hanging="360"/>
-      </w:pPr>
-      <w:rPr>
-        <w:rFonts w:ascii="Wingdings" w:hAnsi="Wingdings" w:cs="Wingdings" w:hint="default"/>
-      </w:rPr>
-    </w:lvl>
-  </w:abstractNum>
   <w:num w:numId="1000">
     <w:abstractNumId w:val="990"/>
   </w:num>
   <w:num w:numId="1001">
-    <w:abstractNumId w:val="99411"/>
-    <w:lvlOverride w:ilvl="0">
-      <w:startOverride w:val="1"/>
-    </w:lvlOverride>
-    <w:lvlOverride w:ilvl="1">
-      <w:startOverride w:val="1"/>
-    </w:lvlOverride>
-    <w:lvlOverride w:ilvl="2">
-      <w:startOverride w:val="1"/>
-    </w:lvlOverride>
-    <w:lvlOverride w:ilvl="3">
-      <w:startOverride w:val="1"/>
-    </w:lvlOverride>
-    <w:lvlOverride w:ilvl="4">
-      <w:startOverride w:val="1"/>
-    </w:lvlOverride>
-    <w:lvlOverride w:ilvl="5">
-      <w:startOverride w:val="1"/>
-    </w:lvlOverride>
-    <w:lvlOverride w:ilvl="6">
-      <w:startOverride w:val="1"/>
-    </w:lvlOverride>
-    <w:lvlOverride w:ilvl="7">
-      <w:startOverride w:val="1"/>
-    </w:lvlOverride>
-    <w:lvlOverride w:ilvl="8">
-      <w:startOverride w:val="1"/>
-    </w:lvlOverride>
+    <w:abstractNumId w:val="991"/>
   </w:num>
   <w:num w:numId="1002">
     <w:abstractNumId w:val="99411"/>
@@ -5922,7 +6044,34 @@
     </w:lvlOverride>
   </w:num>
   <w:num w:numId="1003">
-    <w:abstractNumId w:val="991"/>
+    <w:abstractNumId w:val="99411"/>
+    <w:lvlOverride w:ilvl="0">
+      <w:startOverride w:val="1"/>
+    </w:lvlOverride>
+    <w:lvlOverride w:ilvl="1">
+      <w:startOverride w:val="1"/>
+    </w:lvlOverride>
+    <w:lvlOverride w:ilvl="2">
+      <w:startOverride w:val="1"/>
+    </w:lvlOverride>
+    <w:lvlOverride w:ilvl="3">
+      <w:startOverride w:val="1"/>
+    </w:lvlOverride>
+    <w:lvlOverride w:ilvl="4">
+      <w:startOverride w:val="1"/>
+    </w:lvlOverride>
+    <w:lvlOverride w:ilvl="5">
+      <w:startOverride w:val="1"/>
+    </w:lvlOverride>
+    <w:lvlOverride w:ilvl="6">
+      <w:startOverride w:val="1"/>
+    </w:lvlOverride>
+    <w:lvlOverride w:ilvl="7">
+      <w:startOverride w:val="1"/>
+    </w:lvlOverride>
+    <w:lvlOverride w:ilvl="8">
+      <w:startOverride w:val="1"/>
+    </w:lvlOverride>
   </w:num>
   <w:num w:numId="1004">
     <w:abstractNumId w:val="991"/>
@@ -5991,6 +6140,9 @@
     <w:abstractNumId w:val="991"/>
   </w:num>
   <w:num w:numId="1026">
+    <w:abstractNumId w:val="991"/>
+  </w:num>
+  <w:num w:numId="1027">
     <w:abstractNumId w:val="99411"/>
     <w:lvlOverride w:ilvl="0">
       <w:startOverride w:val="1"/>
@@ -6020,7 +6172,7 @@
       <w:startOverride w:val="1"/>
     </w:lvlOverride>
   </w:num>
-  <w:num w:numId="1027">
+  <w:num w:numId="1028">
     <w:abstractNumId w:val="991"/>
   </w:num>
 </w:numbering>

</xml_diff>

<commit_message>
docs: separação fiscal serviço × consumo em toda a cadeia (4ª veia transversal)
Todo item vendável e lançamento nasce classificado como SERVIÇO (NFS-e/ISS)
ou CONSUMO (NF-e/NFC-e/ICMS) desde a fase 1; extrato, check-out e módulo
Fiscal agrupam e emitem por natureza.

Co-Authored-By: Claude Fable 5 <noreply@anthropic.com>
</commit_message>
<xml_diff>
--- a/docs/ESPECIFICACAO.docx
+++ b/docs/ESPECIFICACAO.docx
@@ -1647,13 +1647,13 @@
         </w:tc>
       </w:tr>
     </w:tbl>
-    <w:bookmarkStart w:id="13" w:name="as-três-veias-transversais"/>
+    <w:bookmarkStart w:id="13" w:name="as-quatro-veias-transversais"/>
     <w:p>
       <w:pPr>
         <w:pStyle w:val="Heading3"/>
       </w:pPr>
       <w:r>
-        <w:t xml:space="preserve">As três "veias" transversais</w:t>
+        <w:t xml:space="preserve">As quatro "veias" transversais</w:t>
       </w:r>
     </w:p>
     <w:p>
@@ -1738,6 +1738,90 @@
       </w:r>
       <w:r>
         <w:t xml:space="preserve">estoque. Transferências entre módulos são rastreadas dos dois lados.</w:t>
+      </w:r>
+    </w:p>
+    <w:p>
+      <w:pPr>
+        <w:pStyle w:val="Compact"/>
+        <w:numPr>
+          <w:ilvl w:val="0"/>
+          <w:numId w:val="1003"/>
+        </w:numPr>
+      </w:pPr>
+      <w:r>
+        <w:rPr>
+          <w:b/>
+          <w:bCs/>
+        </w:rPr>
+        <w:t xml:space="preserve">Natureza fiscal (serviço × consumo)</w:t>
+      </w:r>
+      <w:r>
+        <w:t xml:space="preserve"> </w:t>
+      </w:r>
+      <w:r>
+        <w:t xml:space="preserve">— todo item vendável e todo lançamento</w:t>
+      </w:r>
+      <w:r>
+        <w:t xml:space="preserve"> </w:t>
+      </w:r>
+      <w:r>
+        <w:t xml:space="preserve">nasce classificado como</w:t>
+      </w:r>
+      <w:r>
+        <w:t xml:space="preserve"> </w:t>
+      </w:r>
+      <w:r>
+        <w:rPr>
+          <w:b/>
+          <w:bCs/>
+        </w:rPr>
+        <w:t xml:space="preserve">SERVIÇO</w:t>
+      </w:r>
+      <w:r>
+        <w:t xml:space="preserve"> </w:t>
+      </w:r>
+      <w:r>
+        <w:t xml:space="preserve">(diária, lavanderia do hóspede, taxas,</w:t>
+      </w:r>
+      <w:r>
+        <w:t xml:space="preserve"> </w:t>
+      </w:r>
+      <w:r>
+        <w:t xml:space="preserve">day use) ou</w:t>
+      </w:r>
+      <w:r>
+        <w:t xml:space="preserve"> </w:t>
+      </w:r>
+      <w:r>
+        <w:rPr>
+          <w:b/>
+          <w:bCs/>
+        </w:rPr>
+        <w:t xml:space="preserve">CONSUMO</w:t>
+      </w:r>
+      <w:r>
+        <w:t xml:space="preserve"> </w:t>
+      </w:r>
+      <w:r>
+        <w:t xml:space="preserve">(produto: loja, restaurante, frigobar). A classificação</w:t>
+      </w:r>
+      <w:r>
+        <w:t xml:space="preserve"> </w:t>
+      </w:r>
+      <w:r>
+        <w:t xml:space="preserve">é obrigatória desde a fase 1 porque a nota fiscal é separada: serviço → NFS-e</w:t>
+      </w:r>
+      <w:r>
+        <w:t xml:space="preserve"> </w:t>
+      </w:r>
+      <w:r>
+        <w:t xml:space="preserve">(ISS, municipal); consumo → NF-e/NFC-e (ICMS, estadual). Extratos, fechamento</w:t>
+      </w:r>
+      <w:r>
+        <w:t xml:space="preserve"> </w:t>
+      </w:r>
+      <w:r>
+        <w:t xml:space="preserve">de conta e relatórios sempre permitem visão separada por natureza.</w:t>
       </w:r>
     </w:p>
     <w:p>
@@ -2417,6 +2501,63 @@
           <w:b/>
           <w:bCs/>
         </w:rPr>
+        <w:t xml:space="preserve">Natureza fiscal por item</w:t>
+      </w:r>
+      <w:r>
+        <w:t xml:space="preserve">: todo item vendável é classificado como</w:t>
+      </w:r>
+      <w:r>
+        <w:t xml:space="preserve"> </w:t>
+      </w:r>
+      <w:r>
+        <w:rPr>
+          <w:b/>
+          <w:bCs/>
+        </w:rPr>
+        <w:t xml:space="preserve">consumo</w:t>
+      </w:r>
+      <w:r>
+        <w:t xml:space="preserve"> </w:t>
+      </w:r>
+      <w:r>
+        <w:t xml:space="preserve">(produto físico, baixa estoque) ou</w:t>
+      </w:r>
+      <w:r>
+        <w:t xml:space="preserve"> </w:t>
+      </w:r>
+      <w:r>
+        <w:rPr>
+          <w:b/>
+          <w:bCs/>
+        </w:rPr>
+        <w:t xml:space="preserve">serviço</w:t>
+      </w:r>
+      <w:r>
+        <w:t xml:space="preserve"> </w:t>
+      </w:r>
+      <w:r>
+        <w:t xml:space="preserve">(não baixa estoque). Uma comanda</w:t>
+      </w:r>
+      <w:r>
+        <w:t xml:space="preserve"> </w:t>
+      </w:r>
+      <w:r>
+        <w:t xml:space="preserve">pode misturar os dois; o fechamento e a futura emissão fiscal separam por natureza.</w:t>
+      </w:r>
+    </w:p>
+    <w:p>
+      <w:pPr>
+        <w:pStyle w:val="Compact"/>
+        <w:numPr>
+          <w:ilvl w:val="0"/>
+          <w:numId w:val="1008"/>
+        </w:numPr>
+      </w:pPr>
+      <w:r>
+        <w:rPr>
+          <w:b/>
+          <w:bCs/>
+        </w:rPr>
         <w:t xml:space="preserve">Dois destinos de cobrança</w:t>
       </w:r>
       <w:r>
@@ -2958,7 +3099,35 @@
         <w:t xml:space="preserve"> </w:t>
       </w:r>
       <w:r>
-        <w:t xml:space="preserve">consumos dos PDVs, serviços, descontos, adiantamentos como crédito; extrato completo.</w:t>
+        <w:t xml:space="preserve">consumos dos PDVs, serviços, descontos, adiantamentos como crédito; extrato completo</w:t>
+      </w:r>
+      <w:r>
+        <w:t xml:space="preserve"> </w:t>
+      </w:r>
+      <w:r>
+        <w:t xml:space="preserve">com</w:t>
+      </w:r>
+      <w:r>
+        <w:t xml:space="preserve"> </w:t>
+      </w:r>
+      <w:r>
+        <w:rPr>
+          <w:b/>
+          <w:bCs/>
+        </w:rPr>
+        <w:t xml:space="preserve">separação serviço × consumo</w:t>
+      </w:r>
+      <w:r>
+        <w:t xml:space="preserve"> </w:t>
+      </w:r>
+      <w:r>
+        <w:t xml:space="preserve">(subtotais por natureza — base para a nota</w:t>
+      </w:r>
+      <w:r>
+        <w:t xml:space="preserve"> </w:t>
+      </w:r>
+      <w:r>
+        <w:t xml:space="preserve">fiscal separada e para o hóspede conferir a conta).</w:t>
       </w:r>
     </w:p>
     <w:p>
@@ -4319,7 +4488,20 @@
               <w:pStyle w:val="Compact"/>
             </w:pPr>
             <w:r>
-              <w:t xml:space="preserve">NFS-e/NF-e/NFC-e via intermediador (Focus NFe/eNotas); emissão no check-out e nos PDVs</w:t>
+              <w:t xml:space="preserve">Emissão via intermediador (Focus NFe/eNotas),</w:t>
+            </w:r>
+            <w:r>
+              <w:t xml:space="preserve"> </w:t>
+            </w:r>
+            <w:r>
+              <w:rPr>
+                <w:b/>
+                <w:bCs/>
+              </w:rPr>
+              <w:t xml:space="preserve">separada por natureza</w:t>
+            </w:r>
+            <w:r>
+              <w:t xml:space="preserve">: serviços → NFS-e (ISS); consumo/produtos → NF-e/NFC-e (ICMS). No check-out, o sistema agrupa os lançamentos da conta por natureza e emite os documentos correspondentes; nos PDVs, emissão na venda avulsa. A classificação vem pronta da fase 1 (natureza em todo item/lançamento)</w:t>
             </w:r>
           </w:p>
         </w:tc>
@@ -4446,7 +4628,7 @@
         <w:rPr>
           <w:rStyle w:val="VerbatimChar"/>
         </w:rPr>
-        <w:t xml:space="preserve">   │       │      └ MotivoCancelamento        │   serviço, desconto, crédito)</w:t>
+        <w:t xml:space="preserve">   │       │      └ MotivoCancelamento        │   serviço, desconto, crédito;</w:t>
       </w:r>
       <w:r>
         <w:br/>
@@ -4455,6 +4637,15 @@
         <w:rPr>
           <w:rStyle w:val="VerbatimChar"/>
         </w:rPr>
+        <w:t xml:space="preserve">   │       │                                  │   natureza: SERVIÇO | CONSUMO)</w:t>
+      </w:r>
+      <w:r>
+        <w:br/>
+      </w:r>
+      <w:r>
+        <w:rPr>
+          <w:rStyle w:val="VerbatimChar"/>
+        </w:rPr>
         <w:t xml:space="preserve">Temporada  │                                  ├─ Pagamento ─ Estorno</w:t>
       </w:r>
       <w:r>
@@ -4741,6 +4932,94 @@
       </w:r>
       <w:r>
         <w:t xml:space="preserve">, nunca float.</w:t>
+      </w:r>
+    </w:p>
+    <w:p>
+      <w:pPr>
+        <w:pStyle w:val="Compact"/>
+        <w:numPr>
+          <w:ilvl w:val="0"/>
+          <w:numId w:val="1026"/>
+        </w:numPr>
+      </w:pPr>
+      <w:r>
+        <w:t xml:space="preserve">Todo item vendável (</w:t>
+      </w:r>
+      <w:r>
+        <w:rPr>
+          <w:rStyle w:val="VerbatimChar"/>
+        </w:rPr>
+        <w:t xml:space="preserve">Produto</w:t>
+      </w:r>
+      <w:r>
+        <w:t xml:space="preserve">, item de cardápio, serviço de lavanderia, diária)</w:t>
+      </w:r>
+      <w:r>
+        <w:t xml:space="preserve"> </w:t>
+      </w:r>
+      <w:r>
+        <w:t xml:space="preserve">e todo</w:t>
+      </w:r>
+      <w:r>
+        <w:t xml:space="preserve"> </w:t>
+      </w:r>
+      <w:r>
+        <w:rPr>
+          <w:rStyle w:val="VerbatimChar"/>
+        </w:rPr>
+        <w:t xml:space="preserve">Lançamento</w:t>
+      </w:r>
+      <w:r>
+        <w:t xml:space="preserve"> </w:t>
+      </w:r>
+      <w:r>
+        <w:t xml:space="preserve">carregam</w:t>
+      </w:r>
+      <w:r>
+        <w:t xml:space="preserve"> </w:t>
+      </w:r>
+      <w:r>
+        <w:rPr>
+          <w:b/>
+          <w:bCs/>
+        </w:rPr>
+        <w:t xml:space="preserve">natureza fiscal</w:t>
+      </w:r>
+      <w:r>
+        <w:t xml:space="preserve"> </w:t>
+      </w:r>
+      <w:r>
+        <w:t xml:space="preserve">(</w:t>
+      </w:r>
+      <w:r>
+        <w:rPr>
+          <w:rStyle w:val="VerbatimChar"/>
+        </w:rPr>
+        <w:t xml:space="preserve">SERVICO</w:t>
+      </w:r>
+      <w:r>
+        <w:t xml:space="preserve"> </w:t>
+      </w:r>
+      <w:r>
+        <w:t xml:space="preserve">|</w:t>
+      </w:r>
+      <w:r>
+        <w:t xml:space="preserve"> </w:t>
+      </w:r>
+      <w:r>
+        <w:rPr>
+          <w:rStyle w:val="VerbatimChar"/>
+        </w:rPr>
+        <w:t xml:space="preserve">CONSUMO</w:t>
+      </w:r>
+      <w:r>
+        <w:t xml:space="preserve">) —</w:t>
+      </w:r>
+      <w:r>
+        <w:t xml:space="preserve"> </w:t>
+      </w:r>
+      <w:r>
+        <w:t xml:space="preserve">obrigatória, sem default silencioso, para a emissão de nota separada (módulo Fiscal).</w:t>
       </w:r>
     </w:p>
     <w:p>

</xml_diff>